<commit_message>
feat: add functionality to cancel position draft requests including cleanup of associated documents and logs
</commit_message>
<xml_diff>
--- a/HRCP-KKU-Academic/uploads/academic/2/doc_4_copy_1.docx
+++ b/HRCP-KKU-Academic/uploads/academic/2/doc_4_copy_1.docx
@@ -25,7 +25,6 @@
           <w:color w:val="000000" w:themeColor="text1"/>
           <w:sz w:val="56"/>
           <w:szCs w:val="56"/>
-          <w:bdr w:val="none" w:sz="0" w:space="0" w:color="auto" w:frame="1"/>
           <w:lang w:val="en-US"/>
         </w:rPr>
         <w:drawing>
@@ -40,7 +39,7 @@
             <wp:extent cx="468000" cy="764082"/>
             <wp:effectExtent l="0" t="0" r="8255" b="0"/>
             <wp:wrapNone/>
-            <wp:docPr id="1" name="Picture 1" descr="https://lh3.googleusercontent.com/RUGxSPAwTS4yvIpoPVCk8wMCSE6vWtoCU_mCL5tGlpb3_d2QI-5TYLPoKo3S3ZdGM0Opl29NbcWPmKR4fHvqOoEokHbXGUGlwY238swDT41QDsXoOkf3VwFKCEt9w9leEPgLeNE"/>
+            <wp:docPr id="1" name="Picture 1"/>
             <wp:cNvGraphicFramePr>
               <a:graphicFrameLocks xmlns:a="http://schemas.openxmlformats.org/drawingml/2006/main" noChangeAspect="1"/>
             </wp:cNvGraphicFramePr>
@@ -48,7 +47,7 @@
               <a:graphicData uri="http://schemas.openxmlformats.org/drawingml/2006/picture">
                 <pic:pic xmlns:pic="http://schemas.openxmlformats.org/drawingml/2006/picture">
                   <pic:nvPicPr>
-                    <pic:cNvPr id="0" name="Picture 1" descr="https://lh3.googleusercontent.com/RUGxSPAwTS4yvIpoPVCk8wMCSE6vWtoCU_mCL5tGlpb3_d2QI-5TYLPoKo3S3ZdGM0Opl29NbcWPmKR4fHvqOoEokHbXGUGlwY238swDT41QDsXoOkf3VwFKCEt9w9leEPgLeNE"/>
+                    <pic:cNvPr id="0" name="Picture 1"/>
                     <pic:cNvPicPr>
                       <a:picLocks noChangeAspect="1" noChangeArrowheads="1"/>
                     </pic:cNvPicPr>
@@ -236,84 +235,22 @@
           <w:color w:val="000000" w:themeColor="text1"/>
           <w:sz w:val="32"/>
           <w:szCs w:val="32"/>
-          <w:cs/>
-          <w:lang w:eastAsia="en-GB"/>
-        </w:rPr>
-        <w:t xml:space="preserve">อว </w:t>
-      </w:r>
-      <w:r>
-        <w:rPr>
-          <w:rFonts w:ascii="TH Sarabun New" w:eastAsia="Times New Roman" w:hAnsi="TH Sarabun New" w:cs="TH Sarabun New"/>
-          <w:color w:val="000000" w:themeColor="text1"/>
-          <w:sz w:val="32"/>
-          <w:szCs w:val="32"/>
-          <w:lang w:eastAsia="en-GB"/>
-        </w:rPr>
-        <w:t>660301</w:t>
-      </w:r>
-      <w:r>
-        <w:rPr>
-          <w:rFonts w:ascii="TH Sarabun New" w:eastAsia="Times New Roman" w:hAnsi="TH Sarabun New" w:cs="TH Sarabun New"/>
-          <w:color w:val="000000" w:themeColor="text1"/>
-          <w:sz w:val="32"/>
-          <w:szCs w:val="32"/>
-          <w:cs/>
-          <w:lang w:eastAsia="en-GB"/>
-        </w:rPr>
-        <w:t>.</w:t>
-      </w:r>
-      <w:r>
-        <w:rPr>
-          <w:rFonts w:ascii="TH Sarabun New" w:eastAsia="Times New Roman" w:hAnsi="TH Sarabun New" w:cs="TH Sarabun New"/>
-          <w:color w:val="000000" w:themeColor="text1"/>
-          <w:sz w:val="32"/>
-          <w:szCs w:val="32"/>
-          <w:lang w:eastAsia="en-GB"/>
-        </w:rPr>
-        <w:t>26</w:t>
-      </w:r>
-      <w:r>
-        <w:rPr>
-          <w:rFonts w:ascii="TH Sarabun New" w:eastAsia="Times New Roman" w:hAnsi="TH Sarabun New" w:cs="TH Sarabun New"/>
-          <w:color w:val="000000" w:themeColor="text1"/>
-          <w:sz w:val="32"/>
-          <w:szCs w:val="32"/>
-          <w:cs/>
-          <w:lang w:eastAsia="en-GB"/>
-        </w:rPr>
-        <w:t>.4/</w:t>
-      </w:r>
-      <w:r>
-        <w:rPr>
-          <w:rFonts w:ascii="TH Sarabun New" w:eastAsia="Times New Roman" w:hAnsi="TH Sarabun New" w:cs="TH Sarabun New" w:hint="cs"/>
-          <w:color w:val="000000" w:themeColor="text1"/>
-          <w:sz w:val="32"/>
-          <w:szCs w:val="32"/>
-          <w:cs/>
-          <w:lang w:eastAsia="en-GB"/>
-        </w:rPr>
-        <w:t xml:space="preserve">ว. </w:t>
-      </w:r>
-      <w:r>
-        <w:rPr>
-          <w:rFonts w:ascii="TH Sarabun New" w:eastAsia="Times New Roman" w:hAnsi="TH Sarabun New" w:cs="TH Sarabun New"/>
-          <w:color w:val="000000" w:themeColor="text1"/>
-          <w:sz w:val="32"/>
-          <w:szCs w:val="32"/>
-          <w:lang w:val="en-US" w:eastAsia="en-GB"/>
-        </w:rPr>
-        <w:t/>
-      </w:r>
-      <w:r>
-        <w:rPr>
-          <w:rFonts w:ascii="TH Sarabun New" w:eastAsia="Times New Roman" w:hAnsi="TH Sarabun New" w:cs="TH Sarabun New"/>
-          <w:color w:val="000000" w:themeColor="text1"/>
-          <w:sz w:val="32"/>
-          <w:szCs w:val="32"/>
-          <w:lang w:val="en-US" w:eastAsia="en-GB"/>
-        </w:rPr>
-        <w:t/>
-      </w:r>
+          <w:lang w:val="en-US" w:eastAsia="en-GB"/>
+        </w:rPr>
+        <w:t>อว 660301.26.4/ว.</w:t>
+      </w:r>
+      <w:proofErr w:type="spellStart"/>
+      <w:r>
+        <w:rPr>
+          <w:rFonts w:ascii="TH Sarabun New" w:eastAsia="Times New Roman" w:hAnsi="TH Sarabun New" w:cs="TH Sarabun New"/>
+          <w:color w:val="000000" w:themeColor="text1"/>
+          <w:sz w:val="32"/>
+          <w:szCs w:val="32"/>
+          <w:lang w:val="en-US" w:eastAsia="en-GB"/>
+        </w:rPr>
+        <w:t/>
+      </w:r>
+      <w:proofErr w:type="spellEnd"/>
       <w:r>
         <w:rPr>
           <w:rFonts w:ascii="TH Sarabun New" w:eastAsia="Times New Roman" w:hAnsi="TH Sarabun New" w:cs="TH Sarabun New"/>
@@ -410,7 +347,7 @@
           <w:szCs w:val="32"/>
           <w:lang w:val="en-US" w:eastAsia="en-GB"/>
         </w:rPr>
-        <w:t>7 มีนาคม 2569</w:t>
+        <w:t>11 สิงหาคม 2569</w:t>
       </w:r>
       <w:r>
         <w:rPr>
@@ -561,6 +498,28 @@
         </w:rPr>
         <w:tab/>
       </w:r>
+      <w:r>
+        <w:rPr>
+          <w:rFonts w:ascii="TH Sarabun New" w:eastAsia="Times New Roman" w:hAnsi="TH Sarabun New" w:cs="TH Sarabun New"/>
+          <w:color w:val="000000" w:themeColor="text1"/>
+          <w:sz w:val="32"/>
+          <w:szCs w:val="32"/>
+          <w:lang w:val="en-US" w:eastAsia="en-GB"/>
+        </w:rPr>
+        <w:t>12</w:t>
+      </w:r>
+      <w:proofErr w:type="spellStart"/>
+      <w:r>
+        <w:rPr>
+          <w:rFonts w:ascii="TH Sarabun New" w:eastAsia="Times New Roman" w:hAnsi="TH Sarabun New" w:cs="TH Sarabun New"/>
+          <w:color w:val="000000" w:themeColor="text1"/>
+          <w:sz w:val="32"/>
+          <w:szCs w:val="32"/>
+          <w:lang w:val="en-US" w:eastAsia="en-GB"/>
+        </w:rPr>
+        <w:t/>
+      </w:r>
+      <w:proofErr w:type="spellEnd"/>
       <w:r>
         <w:rPr>
           <w:rFonts w:ascii="TH Sarabun New" w:eastAsia="Times New Roman" w:hAnsi="TH Sarabun New" w:cs="TH Sarabun New"/>
@@ -628,16 +587,18 @@
         </w:rPr>
         <w:t/>
       </w:r>
-      <w:r>
-        <w:rPr>
-          <w:rFonts w:ascii="TH Sarabun New" w:eastAsia="Times New Roman" w:hAnsi="TH Sarabun New" w:cs="TH Sarabun New"/>
-          <w:color w:val="000000" w:themeColor="text1"/>
-          <w:sz w:val="32"/>
-          <w:szCs w:val="32"/>
-          <w:lang w:val="en-US" w:eastAsia="en-GB"/>
-        </w:rPr>
-        <w:t/>
-      </w:r>
+      <w:proofErr w:type="spellStart"/>
+      <w:r>
+        <w:rPr>
+          <w:rFonts w:ascii="TH Sarabun New" w:eastAsia="Times New Roman" w:hAnsi="TH Sarabun New" w:cs="TH Sarabun New"/>
+          <w:color w:val="000000" w:themeColor="text1"/>
+          <w:sz w:val="32"/>
+          <w:szCs w:val="32"/>
+          <w:lang w:val="en-US" w:eastAsia="en-GB"/>
+        </w:rPr>
+        <w:t/>
+      </w:r>
+      <w:proofErr w:type="spellEnd"/>
       <w:r>
         <w:rPr>
           <w:rFonts w:ascii="TH Sarabun New" w:eastAsia="Times New Roman" w:hAnsi="TH Sarabun New" w:cs="TH Sarabun New"/>
@@ -667,18 +628,20 @@
           <w:szCs w:val="32"/>
           <w:lang w:val="en-US" w:eastAsia="en-GB"/>
         </w:rPr>
-        <w:t>7 มีนาคม 2569</w:t>
-      </w:r>
-      <w:r>
-        <w:rPr>
-          <w:rFonts w:ascii="TH Sarabun New" w:eastAsia="Times New Roman" w:hAnsi="TH Sarabun New" w:cs="TH Sarabun New"/>
-          <w:color w:val="000000" w:themeColor="text1"/>
-          <w:sz w:val="32"/>
-          <w:szCs w:val="32"/>
-          <w:lang w:val="en-US" w:eastAsia="en-GB"/>
-        </w:rPr>
-        <w:t/>
-      </w:r>
+        <w:t>11 สิงหาคม 2569</w:t>
+      </w:r>
+      <w:proofErr w:type="spellStart"/>
+      <w:r>
+        <w:rPr>
+          <w:rFonts w:ascii="TH Sarabun New" w:eastAsia="Times New Roman" w:hAnsi="TH Sarabun New" w:cs="TH Sarabun New"/>
+          <w:color w:val="000000" w:themeColor="text1"/>
+          <w:sz w:val="32"/>
+          <w:szCs w:val="32"/>
+          <w:lang w:val="en-US" w:eastAsia="en-GB"/>
+        </w:rPr>
+        <w:t/>
+      </w:r>
+      <w:proofErr w:type="spellEnd"/>
       <w:r>
         <w:rPr>
           <w:rFonts w:ascii="TH Sarabun New" w:eastAsia="Times New Roman" w:hAnsi="TH Sarabun New" w:cs="TH Sarabun New"/>
@@ -710,36 +673,60 @@
         </w:rPr>
         <w:t>ผู้ช่วยศาสตราจารย์</w:t>
       </w:r>
-      <w:r>
-        <w:rPr>
-          <w:rFonts w:ascii="TH Sarabun New" w:eastAsia="Times New Roman" w:hAnsi="TH Sarabun New" w:cs="TH Sarabun New"/>
-          <w:color w:val="000000" w:themeColor="text1"/>
-          <w:sz w:val="32"/>
-          <w:szCs w:val="32"/>
-          <w:lang w:val="en-US" w:eastAsia="en-GB"/>
-        </w:rPr>
-        <w:t>Apec</w:t>
-      </w:r>
-      <w:r>
-        <w:rPr>
-          <w:rFonts w:ascii="TH Sarabun New" w:eastAsia="Times New Roman" w:hAnsi="TH Sarabun New" w:cs="TH Sarabun New"/>
-          <w:color w:val="000000" w:themeColor="text1"/>
-          <w:sz w:val="32"/>
-          <w:szCs w:val="32"/>
-          <w:lang w:val="en-US" w:eastAsia="en-GB"/>
-        </w:rPr>
-        <w:t/>
-      </w:r>
-      <w:r>
-        <w:rPr>
-          <w:rFonts w:ascii="TH Sarabun New" w:eastAsia="Times New Roman" w:hAnsi="TH Sarabun New" w:cs="TH Sarabun New"/>
-          <w:color w:val="000000" w:themeColor="text1"/>
-          <w:sz w:val="32"/>
-          <w:szCs w:val="32"/>
-          <w:lang w:val="en-US" w:eastAsia="en-GB"/>
-        </w:rPr>
-        <w:t/>
-      </w:r>
+      <w:proofErr w:type="spellStart"/>
+      <w:r>
+        <w:rPr>
+          <w:rFonts w:ascii="TH Sarabun New" w:eastAsia="Times New Roman" w:hAnsi="TH Sarabun New" w:cs="TH Sarabun New"/>
+          <w:color w:val="000000" w:themeColor="text1"/>
+          <w:sz w:val="32"/>
+          <w:szCs w:val="32"/>
+          <w:lang w:val="en-US" w:eastAsia="en-GB"/>
+        </w:rPr>
+        <w:t/>
+      </w:r>
+      <w:proofErr w:type="spellEnd"/>
+      <w:r>
+        <w:rPr>
+          <w:rFonts w:ascii="TH Sarabun New" w:eastAsia="Times New Roman" w:hAnsi="TH Sarabun New" w:cs="TH Sarabun New"/>
+          <w:color w:val="000000" w:themeColor="text1"/>
+          <w:sz w:val="32"/>
+          <w:szCs w:val="32"/>
+          <w:lang w:val="en-US" w:eastAsia="en-GB"/>
+        </w:rPr>
+        <w:t/>
+      </w:r>
+      <w:r>
+        <w:rPr>
+          <w:rFonts w:ascii="TH Sarabun New" w:eastAsia="Times New Roman" w:hAnsi="TH Sarabun New" w:cs="TH Sarabun New"/>
+          <w:color w:val="000000" w:themeColor="text1"/>
+          <w:sz w:val="32"/>
+          <w:szCs w:val="32"/>
+          <w:lang w:val="en-US" w:eastAsia="en-GB"/>
+        </w:rPr>
+        <w:t>ทดสอบ ผู้ใช้งาน</w:t>
+      </w:r>
+      <w:proofErr w:type="spellStart"/>
+      <w:r>
+        <w:rPr>
+          <w:rFonts w:ascii="TH Sarabun New" w:eastAsia="Times New Roman" w:hAnsi="TH Sarabun New" w:cs="TH Sarabun New"/>
+          <w:color w:val="000000" w:themeColor="text1"/>
+          <w:sz w:val="32"/>
+          <w:szCs w:val="32"/>
+          <w:lang w:val="en-US" w:eastAsia="en-GB"/>
+        </w:rPr>
+        <w:t/>
+      </w:r>
+      <w:r>
+        <w:rPr>
+          <w:rFonts w:ascii="TH Sarabun New" w:eastAsia="Times New Roman" w:hAnsi="TH Sarabun New" w:cs="TH Sarabun New"/>
+          <w:color w:val="000000" w:themeColor="text1"/>
+          <w:sz w:val="32"/>
+          <w:szCs w:val="32"/>
+          <w:lang w:val="en-US" w:eastAsia="en-GB"/>
+        </w:rPr>
+        <w:t/>
+      </w:r>
+      <w:proofErr w:type="spellEnd"/>
       <w:r>
         <w:rPr>
           <w:rFonts w:ascii="TH Sarabun New" w:eastAsia="Times New Roman" w:hAnsi="TH Sarabun New" w:cs="TH Sarabun New"/>
@@ -769,18 +756,20 @@
           <w:szCs w:val="32"/>
           <w:lang w:val="en-US" w:eastAsia="en-GB"/>
         </w:rPr>
-        <w:t/>
-      </w:r>
-      <w:r>
-        <w:rPr>
-          <w:rFonts w:ascii="TH Sarabun New" w:eastAsia="Times New Roman" w:hAnsi="TH Sarabun New" w:cs="TH Sarabun New"/>
-          <w:color w:val="000000" w:themeColor="text1"/>
-          <w:sz w:val="32"/>
-          <w:szCs w:val="32"/>
-          <w:lang w:val="en-US" w:eastAsia="en-GB"/>
-        </w:rPr>
-        <w:t/>
-      </w:r>
+        <w:t>ข้าราชการ</w:t>
+      </w:r>
+      <w:proofErr w:type="spellStart"/>
+      <w:r>
+        <w:rPr>
+          <w:rFonts w:ascii="TH Sarabun New" w:eastAsia="Times New Roman" w:hAnsi="TH Sarabun New" w:cs="TH Sarabun New"/>
+          <w:color w:val="000000" w:themeColor="text1"/>
+          <w:sz w:val="32"/>
+          <w:szCs w:val="32"/>
+          <w:lang w:val="en-US" w:eastAsia="en-GB"/>
+        </w:rPr>
+        <w:t/>
+      </w:r>
+      <w:proofErr w:type="spellEnd"/>
       <w:r>
         <w:rPr>
           <w:rFonts w:ascii="TH Sarabun New" w:eastAsia="Times New Roman" w:hAnsi="TH Sarabun New" w:cs="TH Sarabun New"/>
@@ -810,18 +799,20 @@
           <w:szCs w:val="32"/>
           <w:lang w:val="en-US" w:eastAsia="en-GB"/>
         </w:rPr>
-        <w:t/>
-      </w:r>
-      <w:r>
-        <w:rPr>
-          <w:rFonts w:ascii="TH Sarabun New" w:eastAsia="Times New Roman" w:hAnsi="TH Sarabun New" w:cs="TH Sarabun New"/>
-          <w:color w:val="000000" w:themeColor="text1"/>
-          <w:sz w:val="32"/>
-          <w:szCs w:val="32"/>
-          <w:lang w:eastAsia="en-GB"/>
-        </w:rPr>
-        <w:t/>
-      </w:r>
+        <w:t>อาจารย์</w:t>
+      </w:r>
+      <w:proofErr w:type="spellStart"/>
+      <w:r>
+        <w:rPr>
+          <w:rFonts w:ascii="TH Sarabun New" w:eastAsia="Times New Roman" w:hAnsi="TH Sarabun New" w:cs="TH Sarabun New"/>
+          <w:color w:val="000000" w:themeColor="text1"/>
+          <w:sz w:val="32"/>
+          <w:szCs w:val="32"/>
+          <w:lang w:eastAsia="en-GB"/>
+        </w:rPr>
+        <w:t/>
+      </w:r>
+      <w:proofErr w:type="spellEnd"/>
       <w:r>
         <w:rPr>
           <w:rFonts w:ascii="TH Sarabun New" w:eastAsia="Times New Roman" w:hAnsi="TH Sarabun New" w:cs="TH Sarabun New"/>
@@ -851,18 +842,20 @@
           <w:szCs w:val="32"/>
           <w:lang w:val="en-US" w:eastAsia="en-GB"/>
         </w:rPr>
-        <w:t/>
-      </w:r>
-      <w:r>
-        <w:rPr>
-          <w:rFonts w:ascii="TH Sarabun New" w:eastAsia="Times New Roman" w:hAnsi="TH Sarabun New" w:cs="TH Sarabun New"/>
-          <w:color w:val="000000" w:themeColor="text1"/>
-          <w:sz w:val="32"/>
-          <w:szCs w:val="32"/>
-          <w:lang w:val="en-US" w:eastAsia="en-GB"/>
-        </w:rPr>
-        <w:t/>
-      </w:r>
+        <w:t>ผู้ช่วยศาสตราจารย์</w:t>
+      </w:r>
+      <w:proofErr w:type="spellStart"/>
+      <w:r>
+        <w:rPr>
+          <w:rFonts w:ascii="TH Sarabun New" w:eastAsia="Times New Roman" w:hAnsi="TH Sarabun New" w:cs="TH Sarabun New"/>
+          <w:color w:val="000000" w:themeColor="text1"/>
+          <w:sz w:val="32"/>
+          <w:szCs w:val="32"/>
+          <w:lang w:val="en-US" w:eastAsia="en-GB"/>
+        </w:rPr>
+        <w:t/>
+      </w:r>
+      <w:proofErr w:type="spellEnd"/>
       <w:r>
         <w:rPr>
           <w:rFonts w:ascii="TH Sarabun New" w:eastAsia="Times New Roman" w:hAnsi="TH Sarabun New" w:cs="TH Sarabun New"/>
@@ -946,8 +939,9 @@
           <w:szCs w:val="32"/>
           <w:lang w:val="en-US" w:eastAsia="en-GB"/>
         </w:rPr>
-        <w:t>7 มีนาคม 2569</w:t>
-      </w:r>
+        <w:t>11 สิงหาคม 2569</w:t>
+      </w:r>
+      <w:proofErr w:type="spellStart"/>
       <w:r>
         <w:rPr>
           <w:rFonts w:ascii="TH Sarabun New" w:eastAsia="Times New Roman" w:hAnsi="TH Sarabun New" w:cs="TH Sarabun New"/>
@@ -960,6 +954,7 @@
         </w:rPr>
         <w:t/>
       </w:r>
+      <w:proofErr w:type="spellEnd"/>
       <w:r>
         <w:rPr>
           <w:rFonts w:ascii="TH Sarabun New" w:eastAsia="Times New Roman" w:hAnsi="TH Sarabun New" w:cs="TH Sarabun New"/>
@@ -997,6 +992,7 @@
         </w:rPr>
         <w:t/>
       </w:r>
+      <w:proofErr w:type="spellStart"/>
       <w:r>
         <w:rPr>
           <w:rFonts w:ascii="TH Sarabun New" w:eastAsia="Times New Roman" w:hAnsi="TH Sarabun New" w:cs="TH Sarabun New"/>
@@ -1009,6 +1005,7 @@
         </w:rPr>
         <w:t/>
       </w:r>
+      <w:proofErr w:type="spellEnd"/>
       <w:r>
         <w:rPr>
           <w:rFonts w:ascii="TH Sarabun New" w:eastAsia="Times New Roman" w:hAnsi="TH Sarabun New" w:cs="TH Sarabun New"/>
@@ -1072,6 +1069,7 @@
         </w:rPr>
         <w:t/>
       </w:r>
+      <w:proofErr w:type="spellStart"/>
       <w:r>
         <w:rPr>
           <w:rFonts w:ascii="TH Sarabun New" w:eastAsia="Times New Roman" w:hAnsi="TH Sarabun New" w:cs="TH Sarabun New"/>
@@ -1096,6 +1094,7 @@
         </w:rPr>
         <w:t/>
       </w:r>
+      <w:proofErr w:type="spellEnd"/>
       <w:r>
         <w:rPr>
           <w:rFonts w:ascii="TH Sarabun New" w:eastAsia="Times New Roman" w:hAnsi="TH Sarabun New" w:cs="TH Sarabun New"/>
@@ -1133,6 +1132,7 @@
         </w:rPr>
         <w:t/>
       </w:r>
+      <w:proofErr w:type="spellStart"/>
       <w:r>
         <w:rPr>
           <w:rFonts w:ascii="TH Sarabun New" w:eastAsia="Times New Roman" w:hAnsi="TH Sarabun New" w:cs="TH Sarabun New"/>
@@ -1157,6 +1157,7 @@
         </w:rPr>
         <w:t/>
       </w:r>
+      <w:proofErr w:type="spellEnd"/>
       <w:r>
         <w:rPr>
           <w:rFonts w:ascii="TH Sarabun New" w:eastAsia="Times New Roman" w:hAnsi="TH Sarabun New" w:cs="TH Sarabun New"/>
@@ -1507,18 +1508,20 @@
           <w:szCs w:val="32"/>
           <w:lang w:val="en-US" w:eastAsia="en-GB"/>
         </w:rPr>
-        <w:t/>
-      </w:r>
-      <w:r>
-        <w:rPr>
-          <w:rFonts w:ascii="TH Sarabun New" w:eastAsia="Times New Roman" w:hAnsi="TH Sarabun New" w:cs="TH Sarabun New"/>
-          <w:color w:val="000000" w:themeColor="text1"/>
-          <w:sz w:val="32"/>
-          <w:szCs w:val="32"/>
-          <w:lang w:val="en-US" w:eastAsia="en-GB"/>
-        </w:rPr>
-        <w:t/>
-      </w:r>
+        <w:t>12</w:t>
+      </w:r>
+      <w:proofErr w:type="spellStart"/>
+      <w:r>
+        <w:rPr>
+          <w:rFonts w:ascii="TH Sarabun New" w:eastAsia="Times New Roman" w:hAnsi="TH Sarabun New" w:cs="TH Sarabun New"/>
+          <w:color w:val="000000" w:themeColor="text1"/>
+          <w:sz w:val="32"/>
+          <w:szCs w:val="32"/>
+          <w:lang w:val="en-US" w:eastAsia="en-GB"/>
+        </w:rPr>
+        <w:t/>
+      </w:r>
+      <w:proofErr w:type="spellEnd"/>
       <w:r>
         <w:rPr>
           <w:rFonts w:ascii="TH Sarabun New" w:eastAsia="Times New Roman" w:hAnsi="TH Sarabun New" w:cs="TH Sarabun New"/>
@@ -1561,6 +1564,28 @@
           <w:lang w:val="en-US" w:eastAsia="en-GB"/>
         </w:rPr>
         <w:t>คณบดีวิทยาลัยการคอมพิวเตอร์</w:t>
+      </w:r>
+      <w:proofErr w:type="spellStart"/>
+      <w:r>
+        <w:rPr>
+          <w:rFonts w:ascii="TH Sarabun New" w:eastAsia="Times New Roman" w:hAnsi="TH Sarabun New" w:cs="TH Sarabun New"/>
+          <w:color w:val="000000" w:themeColor="text1"/>
+          <w:sz w:val="32"/>
+          <w:szCs w:val="32"/>
+          <w:lang w:val="en-US" w:eastAsia="en-GB"/>
+        </w:rPr>
+        <w:t/>
+      </w:r>
+      <w:proofErr w:type="spellEnd"/>
+      <w:r>
+        <w:rPr>
+          <w:rFonts w:ascii="TH Sarabun New" w:eastAsia="Times New Roman" w:hAnsi="TH Sarabun New" w:cs="TH Sarabun New"/>
+          <w:color w:val="000000" w:themeColor="text1"/>
+          <w:sz w:val="32"/>
+          <w:szCs w:val="32"/>
+          <w:lang w:val="en-US" w:eastAsia="en-GB"/>
+        </w:rPr>
+        <w:t/>
       </w:r>
     </w:p>
     <w:p>

</xml_diff>